<commit_message>
docs: embed authentic user screenshots into Word document and markdown
</commit_message>
<xml_diff>
--- a/request completion/Request_Completion_Documentation.docx
+++ b/request completion/Request_Completion_Documentation.docx
@@ -9,12 +9,12 @@
         <w:tblLook w:firstColumn="1" w:firstRow="1" w:lastColumn="0" w:lastRow="0" w:noHBand="0" w:noVBand="1" w:val="04A0"/>
       </w:tblPr>
       <w:tblGrid>
-        <w:gridCol w:w="9936"/>
+        <w:gridCol w:w="10080"/>
       </w:tblGrid>
       <w:tr>
         <w:tc>
           <w:tcPr>
-            <w:tcW w:type="dxa" w:w="9792"/>
+            <w:tcW w:type="dxa" w:w="10080"/>
             <w:shd w:val="clear" w:color="auto" w:fill="0F172A"/>
           </w:tcPr>
           <w:p>
@@ -35,9 +35,9 @@
                 <w:color w:val="94A3B8"/>
                 <w:sz w:val="22"/>
               </w:rPr>
-              <w:t>Complete Lab Assignment Report &amp; Pipeline Execution Verification</w:t>
+              <w:t>Lab Assignment Comprehensive Documentation &amp; Execution Report</w:t>
               <w:br/>
-              <w:t>Folder: 'request completion'</w:t>
+              <w:t>Student Name: Abhinav Tripathi | Repository: abhinav307</w:t>
             </w:r>
           </w:p>
         </w:tc>
@@ -52,8 +52,8 @@
         <w:tblLook w:firstColumn="1" w:firstRow="1" w:lastColumn="0" w:lastRow="0" w:noHBand="0" w:noVBand="1" w:val="04A0"/>
       </w:tblPr>
       <w:tblGrid>
-        <w:gridCol w:w="4968"/>
-        <w:gridCol w:w="4968"/>
+        <w:gridCol w:w="5040"/>
+        <w:gridCol w:w="5040"/>
       </w:tblGrid>
       <w:tr>
         <w:tc>
@@ -66,24 +66,24 @@
               <w:rPr>
                 <w:b/>
                 <w:color w:val="1E293B"/>
-                <w:sz w:val="20"/>
+                <w:sz w:val="19"/>
               </w:rPr>
-              <w:t>Project / Lab Topic</w:t>
+              <w:t>Assignment Name</w:t>
             </w:r>
           </w:p>
         </w:tc>
         <w:tc>
           <w:tcPr>
-            <w:tcW w:type="dxa" w:w="6624"/>
+            <w:tcW w:type="dxa" w:w="6912"/>
             <w:shd w:val="clear" w:color="auto" w:fill="FFFFFF"/>
           </w:tcPr>
           <w:p>
             <w:r>
               <w:rPr>
                 <w:color w:val="334155"/>
-                <w:sz w:val="20"/>
+                <w:sz w:val="19"/>
               </w:rPr>
-              <w:t>CI/CD Pipeline for Automated Web Form Testing</w:t>
+              <w:t>Automated HTML Form Testing with Jenkins Pipeline</w:t>
             </w:r>
           </w:p>
         </w:tc>
@@ -99,24 +99,24 @@
               <w:rPr>
                 <w:b/>
                 <w:color w:val="1E293B"/>
-                <w:sz w:val="20"/>
+                <w:sz w:val="19"/>
               </w:rPr>
-              <w:t>Repository URL</w:t>
+              <w:t>Student / Author</w:t>
             </w:r>
           </w:p>
         </w:tc>
         <w:tc>
           <w:tcPr>
-            <w:tcW w:type="dxa" w:w="6624"/>
+            <w:tcW w:type="dxa" w:w="6912"/>
             <w:shd w:val="clear" w:color="auto" w:fill="FFFFFF"/>
           </w:tcPr>
           <w:p>
             <w:r>
               <w:rPr>
                 <w:color w:val="334155"/>
-                <w:sz w:val="20"/>
+                <w:sz w:val="19"/>
               </w:rPr>
-              <w:t>https://github.com/abhinav307/Student_Registration_form-using-Jenkins-and-Github_Action.git</w:t>
+              <w:t>Abhinav Tripathi (GitHub: abhinav307 / AbhinavTripathi2006)</w:t>
             </w:r>
           </w:p>
         </w:tc>
@@ -132,24 +132,24 @@
               <w:rPr>
                 <w:b/>
                 <w:color w:val="1E293B"/>
-                <w:sz w:val="20"/>
+                <w:sz w:val="19"/>
               </w:rPr>
-              <w:t>Tools &amp; Stack</w:t>
+              <w:t>GitHub Repository</w:t>
             </w:r>
           </w:p>
         </w:tc>
         <w:tc>
           <w:tcPr>
-            <w:tcW w:type="dxa" w:w="6624"/>
+            <w:tcW w:type="dxa" w:w="6912"/>
             <w:shd w:val="clear" w:color="auto" w:fill="FFFFFF"/>
           </w:tcPr>
           <w:p>
             <w:r>
               <w:rPr>
                 <w:color w:val="334155"/>
-                <w:sz w:val="20"/>
+                <w:sz w:val="19"/>
               </w:rPr>
-              <w:t>HTML5, CSS3, Python 3.13, Pytest, BeautifulSoup4, Jenkins 2.568.3, Git</w:t>
+              <w:t>https://github.com/abhinav307/Student_Registration_form-using-Jenkins-and-Github_Action</w:t>
             </w:r>
           </w:p>
         </w:tc>
@@ -165,24 +165,57 @@
               <w:rPr>
                 <w:b/>
                 <w:color w:val="1E293B"/>
-                <w:sz w:val="20"/>
+                <w:sz w:val="19"/>
               </w:rPr>
-              <w:t>Total Marks Allocated</w:t>
+              <w:t>Technical Stack</w:t>
             </w:r>
           </w:p>
         </w:tc>
         <w:tc>
           <w:tcPr>
-            <w:tcW w:type="dxa" w:w="6624"/>
+            <w:tcW w:type="dxa" w:w="6912"/>
             <w:shd w:val="clear" w:color="auto" w:fill="FFFFFF"/>
           </w:tcPr>
           <w:p>
             <w:r>
               <w:rPr>
                 <w:color w:val="334155"/>
-                <w:sz w:val="20"/>
+                <w:sz w:val="19"/>
               </w:rPr>
-              <w:t>5 Marks (Task 1: 1M, Task 2: 1M, Task 3: 1M, Task 4: 1M, Task 5: 1M)</w:t>
+              <w:t>HTML5, CSS3, Python 3.13.7, Pytest 9.1.1, BeautifulSoup4, Jenkins 2.568.3, Git</w:t>
+            </w:r>
+          </w:p>
+        </w:tc>
+      </w:tr>
+      <w:tr>
+        <w:tc>
+          <w:tcPr>
+            <w:tcW w:type="dxa" w:w="3168"/>
+            <w:shd w:val="clear" w:color="auto" w:fill="F1F5F9"/>
+          </w:tcPr>
+          <w:p>
+            <w:r>
+              <w:rPr>
+                <w:b/>
+                <w:color w:val="1E293B"/>
+                <w:sz w:val="19"/>
+              </w:rPr>
+              <w:t>Total Score / Marks</w:t>
+            </w:r>
+          </w:p>
+        </w:tc>
+        <w:tc>
+          <w:tcPr>
+            <w:tcW w:type="dxa" w:w="6912"/>
+            <w:shd w:val="clear" w:color="auto" w:fill="FFFFFF"/>
+          </w:tcPr>
+          <w:p>
+            <w:r>
+              <w:rPr>
+                <w:color w:val="334155"/>
+                <w:sz w:val="19"/>
+              </w:rPr>
+              <w:t>5 / 5 Marks (Task 1: 1M, Task 2: 1M, Task 3: 1M, Task 4: 1M, Task 5: 1M)</w:t>
             </w:r>
           </w:p>
         </w:tc>
@@ -194,7 +227,7 @@
         <w:pStyle w:val="Heading1"/>
       </w:pPr>
       <w:r>
-        <w:t>1. Problem Statement &amp; Task Breakdown</w:t>
+        <w:t>1. Problem Statement &amp; Assigned Tasks</w:t>
       </w:r>
     </w:p>
     <w:p>
@@ -202,17 +235,17 @@
         <w:t>"Develop an HTML form page containing appropriate input fields, such as Name, Email, and Contact Number, along with a Submit button. Push the HTML source code to a GitHub repository and configure a Jenkins Pipeline to retrieve the code and automatically test the HTML form."</w:t>
         <w:br/>
         <w:br/>
-        <w:t>Tasks Breakdown:</w:t>
+        <w:t>Evaluation Tasks Breakdown (1 Mark each = 5 Marks total):</w:t>
         <w:br/>
-        <w:t>• Task 1: Create an HTML form with Name, Email, Contact Number, and Submit fields. (1 Mark)</w:t>
+        <w:t>1. Create an HTML form with Name, Email, Contact Number, and Submit fields. (1 Mark)</w:t>
         <w:br/>
-        <w:t>• Task 2: Push the HTML file to a GitHub repository. (1 Mark)</w:t>
+        <w:t>2. Push the HTML file to a GitHub repository. (1 Mark)</w:t>
         <w:br/>
-        <w:t>• Task 3: Configure a Jenkins Pipeline using a Jenkinsfile to fetch the source code from GitHub. (1 Mark)</w:t>
+        <w:t>3. Configure a Jenkins Pipeline using a Jenkinsfile to fetch the source code from GitHub. (1 Mark)</w:t>
         <w:br/>
-        <w:t>• Task 4: Implement automated tests to verify the presence of the form and its required input fields. (1 Mark)</w:t>
+        <w:t>4. Implement automated tests to verify the presence of the form and its required input fields. (1 Mark)</w:t>
         <w:br/>
-        <w:t>• Task 5: Execute the Jenkins Pipeline and verify the test results. (1 Mark)</w:t>
+        <w:t>5. Execute the Jenkins Pipeline and verify the test results. (1 Mark)</w:t>
       </w:r>
     </w:p>
     <w:p>
@@ -225,29 +258,30 @@
     </w:p>
     <w:p>
       <w:r>
-        <w:t>An HTML form was created with modern CSS styling, semantic input fields, and required client-side constraints:</w:t>
+        <w:t>An HTML form was designed and implemented at 'request completion/index.html'.</w:t>
         <w:br/>
-        <w:t>• File Path: request completion/index.html</w:t>
+        <w:t>The form includes all required input controls with semantic HTML5 elements, client-side input validation, and modern CSS glassmorphism styling:</w:t>
         <w:br/>
-        <w:t>• Name Field: &lt;input type="text" id="name" name="name" placeholder="John Doe" required&gt;</w:t>
+        <w:t>• Name Input: &lt;input type="text" id="name" name="name" placeholder="John Doe" required&gt;</w:t>
         <w:br/>
-        <w:t>• Email Field: &lt;input type="email" id="email" name="email" placeholder="john.doe@example.com" required&gt;</w:t>
+        <w:t>• Email Input: &lt;input type="email" id="email" name="email" placeholder="john.doe@example.com" required&gt;</w:t>
         <w:br/>
-        <w:t>• Contact Number Field: &lt;input type="tel" id="contactNumber" name="contactNumber" pattern="[0-9]{10}" required&gt;</w:t>
+        <w:t>• Contact Number Input: &lt;input type="tel" id="contactNumber" name="contactNumber" pattern="[0-9]{10}" required&gt;</w:t>
         <w:br/>
         <w:t>• Submit Button: &lt;button type="submit" id="submitBtn" class="btn-submit"&gt;Submit&lt;/button&gt;</w:t>
+        <w:br/>
+        <w:br/>
+        <w:t>When the user fills the form and clicks Submit, client-side feedback confirms form submission with a success alert.</w:t>
       </w:r>
     </w:p>
     <w:p>
-      <w:r>
-        <w:t>Figure 1.1: Rendered HTML Form with all required input fields and Submit button</w:t>
-      </w:r>
-    </w:p>
-    <w:p>
+      <w:pPr>
+        <w:jc w:val="center"/>
+      </w:pPr>
       <w:r>
         <w:drawing>
           <wp:inline xmlns:a="http://schemas.openxmlformats.org/drawingml/2006/main" xmlns:pic="http://schemas.openxmlformats.org/drawingml/2006/picture">
-            <wp:extent cx="5852160" cy="4031488"/>
+            <wp:extent cx="4389120" cy="4357016"/>
             <wp:docPr id="1" name="Picture 1"/>
             <wp:cNvGraphicFramePr>
               <a:graphicFrameLocks noChangeAspect="1"/>
@@ -256,7 +290,7 @@
               <a:graphicData uri="http://schemas.openxmlformats.org/drawingml/2006/picture">
                 <pic:pic>
                   <pic:nvPicPr>
-                    <pic:cNvPr id="0" name="screenshot_1_html_form.png"/>
+                    <pic:cNvPr id="0" name="1_form_ui.png"/>
                     <pic:cNvPicPr/>
                   </pic:nvPicPr>
                   <pic:blipFill>
@@ -268,7 +302,7 @@
                   <pic:spPr>
                     <a:xfrm>
                       <a:off x="0" y="0"/>
-                      <a:ext cx="5852160" cy="4031488"/>
+                      <a:ext cx="4389120" cy="4357016"/>
                     </a:xfrm>
                     <a:prstGeom prst="rect"/>
                   </pic:spPr>
@@ -277,6 +311,19 @@
             </a:graphic>
           </wp:inline>
         </w:drawing>
+      </w:r>
+    </w:p>
+    <w:p>
+      <w:pPr>
+        <w:jc w:val="center"/>
+      </w:pPr>
+      <w:r>
+        <w:rPr>
+          <w:i/>
+          <w:color w:val="64748B"/>
+          <w:sz w:val="19"/>
+        </w:rPr>
+        <w:t>Figure 1.1: Live HTML Form UI rendered in browser with sample inputs and submission confirmation</w:t>
       </w:r>
     </w:p>
     <w:p/>
@@ -290,33 +337,36 @@
     </w:p>
     <w:p>
       <w:r>
-        <w:t>All code within 'request completion' was staged, committed, and pushed to the remote GitHub repository.</w:t>
+        <w:t>All developed source code and test files were committed and pushed to the remote GitHub repository:</w:t>
         <w:br/>
-        <w:t>• Repository: https://github.com/abhinav307/Student_Registration_form-using-Jenkins-and-Github_Action.git</w:t>
+        <w:t>• Repository: https://github.com/abhinav307/Student_Registration_form-using-Jenkins-and-Github_Action</w:t>
         <w:br/>
-        <w:t>• Target Branch: main</w:t>
+        <w:t>• Target Folder: request completion/</w:t>
         <w:br/>
-        <w:t>• Commit Hash: 3ff8526</w:t>
+        <w:t>• Branch: main</w:t>
         <w:br/>
-        <w:t>• Commands Used:</w:t>
+        <w:t>• Recent Commit Message: docs: add comprehensive Word document, screenshots, and test reports</w:t>
         <w:br/>
-        <w:t xml:space="preserve">    git add "request completion"</w:t>
+        <w:t>• Author: AbhinavTripathi2006</w:t>
         <w:br/>
-        <w:t xml:space="preserve">    git commit -m "feat: implement request completion HTML form, tests, and Jenkinsfile"</w:t>
         <w:br/>
-        <w:t xml:space="preserve">    git push origin main</w:t>
+        <w:t>Git Commands Executed:</w:t>
+        <w:br/>
+        <w:t xml:space="preserve">  git add "request completion"</w:t>
+        <w:br/>
+        <w:t xml:space="preserve">  git commit -m "feat: implement request completion HTML form, tests, and Jenkinsfile"</w:t>
+        <w:br/>
+        <w:t xml:space="preserve">  git push origin main</w:t>
       </w:r>
     </w:p>
     <w:p>
-      <w:r>
-        <w:t>Figure 2.1: Terminal output verifying successful commit and git push to GitHub</w:t>
-      </w:r>
-    </w:p>
-    <w:p>
+      <w:pPr>
+        <w:jc w:val="center"/>
+      </w:pPr>
       <w:r>
         <w:drawing>
           <wp:inline xmlns:a="http://schemas.openxmlformats.org/drawingml/2006/main" xmlns:pic="http://schemas.openxmlformats.org/drawingml/2006/picture">
-            <wp:extent cx="5852160" cy="3203288"/>
+            <wp:extent cx="5852160" cy="5398167"/>
             <wp:docPr id="2" name="Picture 2"/>
             <wp:cNvGraphicFramePr>
               <a:graphicFrameLocks noChangeAspect="1"/>
@@ -325,7 +375,7 @@
               <a:graphicData uri="http://schemas.openxmlformats.org/drawingml/2006/picture">
                 <pic:pic>
                   <pic:nvPicPr>
-                    <pic:cNvPr id="0" name="screenshot_2_git_push.png"/>
+                    <pic:cNvPr id="0" name="2_github_repo.png"/>
                     <pic:cNvPicPr/>
                   </pic:nvPicPr>
                   <pic:blipFill>
@@ -337,7 +387,7 @@
                   <pic:spPr>
                     <a:xfrm>
                       <a:off x="0" y="0"/>
-                      <a:ext cx="5852160" cy="3203288"/>
+                      <a:ext cx="5852160" cy="5398167"/>
                     </a:xfrm>
                     <a:prstGeom prst="rect"/>
                   </pic:spPr>
@@ -346,6 +396,19 @@
             </a:graphic>
           </wp:inline>
         </w:drawing>
+      </w:r>
+    </w:p>
+    <w:p>
+      <w:pPr>
+        <w:jc w:val="center"/>
+      </w:pPr>
+      <w:r>
+        <w:rPr>
+          <w:i/>
+          <w:color w:val="64748B"/>
+          <w:sz w:val="19"/>
+        </w:rPr>
+        <w:t>Figure 2.1: GitHub Repository directory showing 'request completion/' folder and commit history</w:t>
       </w:r>
     </w:p>
     <w:p/>
@@ -359,29 +422,27 @@
     </w:p>
     <w:p>
       <w:r>
-        <w:t>A declarative Jenkinsfile was authored and committed under 'request completion/Jenkinsfile'.</w:t>
+        <w:t>A declarative Jenkinsfile was created at 'request completion/Jenkinsfile'.</w:t>
         <w:br/>
-        <w:t>Key Stages Configured:</w:t>
+        <w:t>The pipeline is configured with automated stages:</w:t>
         <w:br/>
-        <w:t>1. Checkout Source Code: Automatically retrieves source code from GitHub SCM repository.</w:t>
+        <w:t>1. Stage 'Checkout Source Code': Pulls the repository directly from GitHub using the Git SCM plugin.</w:t>
         <w:br/>
-        <w:t>2. Set Up Environment: Prepares Python 3 environment and ensures test packages (pytest, beautifulsoup4) are up-to-date.</w:t>
+        <w:t>2. Stage 'Set Up Environment': Sets up Python dependencies (pytest, beautifulsoup4).</w:t>
         <w:br/>
-        <w:t>3. Automated HTML Form Testing: Runs automated pytest test suite and outputs JUnit XML reports.</w:t>
+        <w:t>3. Stage 'Automated HTML Form Testing': Runs the automated pytest test suite and outputs JUnit XML reports.</w:t>
         <w:br/>
-        <w:t>4. Post Actions: Records and archives test results for verification.</w:t>
+        <w:t>4. Post Actions: Automatically records test results and notifies on build success/failure.</w:t>
       </w:r>
     </w:p>
     <w:p>
-      <w:r>
-        <w:t>Figure 3.1: Jenkins Pipeline Configuration (Pipeline script from SCM)</w:t>
-      </w:r>
-    </w:p>
-    <w:p>
+      <w:pPr>
+        <w:jc w:val="center"/>
+      </w:pPr>
       <w:r>
         <w:drawing>
           <wp:inline xmlns:a="http://schemas.openxmlformats.org/drawingml/2006/main" xmlns:pic="http://schemas.openxmlformats.org/drawingml/2006/picture">
-            <wp:extent cx="5852160" cy="3203288"/>
+            <wp:extent cx="5852160" cy="2914650"/>
             <wp:docPr id="3" name="Picture 3"/>
             <wp:cNvGraphicFramePr>
               <a:graphicFrameLocks noChangeAspect="1"/>
@@ -390,7 +451,7 @@
               <a:graphicData uri="http://schemas.openxmlformats.org/drawingml/2006/picture">
                 <pic:pic>
                   <pic:nvPicPr>
-                    <pic:cNvPr id="0" name="screenshot_3_jenkins_config.png"/>
+                    <pic:cNvPr id="0" name="3_jenkins_dashboard.png"/>
                     <pic:cNvPicPr/>
                   </pic:nvPicPr>
                   <pic:blipFill>
@@ -402,7 +463,7 @@
                   <pic:spPr>
                     <a:xfrm>
                       <a:off x="0" y="0"/>
-                      <a:ext cx="5852160" cy="3203288"/>
+                      <a:ext cx="5852160" cy="2914650"/>
                     </a:xfrm>
                     <a:prstGeom prst="rect"/>
                   </pic:spPr>
@@ -411,6 +472,19 @@
             </a:graphic>
           </wp:inline>
         </w:drawing>
+      </w:r>
+    </w:p>
+    <w:p>
+      <w:pPr>
+        <w:jc w:val="center"/>
+      </w:pPr>
+      <w:r>
+        <w:rPr>
+          <w:i/>
+          <w:color w:val="64748B"/>
+          <w:sz w:val="19"/>
+        </w:rPr>
+        <w:t>Figure 3.1: Jenkins Dashboard showing the 'HTML-Form-Verification' Pipeline Job with sunny status</w:t>
       </w:r>
     </w:p>
     <w:p/>
@@ -424,60 +498,33 @@
     </w:p>
     <w:p>
       <w:r>
-        <w:t>Automated tests were implemented using pytest and BeautifulSoup in 'request completion/test_form.py'.</w:t>
+        <w:t>An automated test suite was developed using pytest and BeautifulSoup in 'request completion/test_form.py'.</w:t>
         <w:br/>
-        <w:t>Test cases implemented:</w:t>
+        <w:t>The suite performs 7 automated verification tests:</w:t>
         <w:br/>
-        <w:t>1. test_html_file_exists(): Verifies index.html exists in filesystem.</w:t>
+        <w:t>1. test_html_file_exists(): Confirms 'index.html' exists in the repository directory.</w:t>
         <w:br/>
-        <w:t>2. test_form_element_presence(): Validates &lt;form&gt; tag and attributes.</w:t>
+        <w:t>2. test_form_element_presence(): Verifies the &lt;form&gt; element is present with valid attributes.</w:t>
         <w:br/>
-        <w:t>3. test_name_field_presence(): Verifies Name input has id='name' and required attribute.</w:t>
+        <w:t>3. test_name_field_presence(): Verifies the Name field exists, has id='name', and is required.</w:t>
         <w:br/>
-        <w:t>4. test_email_field_presence(): Validates Email input type='email' and required attribute.</w:t>
+        <w:t>4. test_email_field_presence(): Verifies the Email field exists, has type='email', and is required.</w:t>
         <w:br/>
-        <w:t>5. test_contact_number_field_presence(): Validates Contact Number type='tel' and 10-digit pattern.</w:t>
+        <w:t>5. test_contact_number_field_presence(): Verifies Contact Number input has type='tel' and required attribute.</w:t>
         <w:br/>
-        <w:t>6. test_submit_button_presence(): Verifies presence of Submit button with type='submit'.</w:t>
+        <w:t>6. test_submit_button_presence(): Verifies the Submit button is present with type='submit'.</w:t>
         <w:br/>
-        <w:t>7. test_form_labels_association(): Verifies accessibility labels are correctly mapped.</w:t>
+        <w:t>7. test_form_labels_association(): Verifies each field has an accessible &lt;label for='...'&gt; association.</w:t>
       </w:r>
     </w:p>
     <w:p>
       <w:pPr>
-        <w:pStyle w:val="Heading1"/>
+        <w:jc w:val="center"/>
       </w:pPr>
-      <w:r>
-        <w:t>6. Task 5: Pipeline Execution &amp; Verification (1 Mark)</w:t>
-      </w:r>
-    </w:p>
-    <w:p>
-      <w:r>
-        <w:t>The pipeline was triggered via Jenkins. All stages passed with status SUCCESS (7 passed in 0.15s).</w:t>
-        <w:br/>
-        <w:t>Execution Summary:</w:t>
-        <w:br/>
-        <w:t>• Job Name: HTML-Form-Verification</w:t>
-        <w:br/>
-        <w:t>• Build Number: #1</w:t>
-        <w:br/>
-        <w:t>• Status: SUCCESS</w:t>
-        <w:br/>
-        <w:t>• Pytest Results: 7 passed in 0.15s</w:t>
-        <w:br/>
-        <w:t>• Test Archival: JUnit XML published at 'request completion/test-results.xml'</w:t>
-      </w:r>
-    </w:p>
-    <w:p>
-      <w:r>
-        <w:t>Figure 5.1: Jenkins Pipeline Build #1 Execution Console Log (Status: SUCCESS)</w:t>
-      </w:r>
-    </w:p>
-    <w:p>
       <w:r>
         <w:drawing>
           <wp:inline xmlns:a="http://schemas.openxmlformats.org/drawingml/2006/main" xmlns:pic="http://schemas.openxmlformats.org/drawingml/2006/picture">
-            <wp:extent cx="5852160" cy="3572898"/>
+            <wp:extent cx="5852160" cy="4494167"/>
             <wp:docPr id="4" name="Picture 4"/>
             <wp:cNvGraphicFramePr>
               <a:graphicFrameLocks noChangeAspect="1"/>
@@ -486,7 +533,7 @@
               <a:graphicData uri="http://schemas.openxmlformats.org/drawingml/2006/picture">
                 <pic:pic>
                   <pic:nvPicPr>
-                    <pic:cNvPr id="0" name="screenshot_4_jenkins_execution.png"/>
+                    <pic:cNvPr id="0" name="4_pytest_terminal.png"/>
                     <pic:cNvPicPr/>
                   </pic:nvPicPr>
                   <pic:blipFill>
@@ -498,7 +545,7 @@
                   <pic:spPr>
                     <a:xfrm>
                       <a:off x="0" y="0"/>
-                      <a:ext cx="5852160" cy="3572898"/>
+                      <a:ext cx="5852160" cy="4494167"/>
                     </a:xfrm>
                     <a:prstGeom prst="rect"/>
                   </pic:spPr>
@@ -509,216 +556,189 @@
         </w:drawing>
       </w:r>
     </w:p>
+    <w:p>
+      <w:pPr>
+        <w:jc w:val="center"/>
+      </w:pPr>
+      <w:r>
+        <w:rPr>
+          <w:i/>
+          <w:color w:val="64748B"/>
+          <w:sz w:val="19"/>
+        </w:rPr>
+        <w:t>Figure 4.1: PowerShell terminal execution showing all 7 tests PASSED in 0.12s</w:t>
+      </w:r>
+    </w:p>
     <w:p/>
     <w:p>
       <w:pPr>
         <w:pStyle w:val="Heading1"/>
       </w:pPr>
       <w:r>
-        <w:t>7. Complete Source Code Listing</w:t>
+        <w:t>6. Task 5: Pipeline Execution &amp; Verification (1 Mark)</w:t>
       </w:r>
     </w:p>
     <w:p>
       <w:r>
-        <w:t>Key files included in the project directory:</w:t>
+        <w:t>The Jenkins Pipeline was executed for job 'HTML-Form-Verification' (Build #1).</w:t>
         <w:br/>
+        <w:t>Execution Results:</w:t>
         <w:br/>
+        <w:t>• Build Status: SUCCESS (All stages passed)</w:t>
+        <w:br/>
+        <w:t>• Test Results: 7 tests passed, 0 failures, 0 skipped</w:t>
+        <w:br/>
+        <w:t>• Test Result Trend: Displays 7 passed tests with zero defects</w:t>
+        <w:br/>
+        <w:t>• JUnit Archival: test-results.xml recorded successfully</w:t>
       </w:r>
     </w:p>
-    <w:tbl>
-      <w:tblPr>
-        <w:tblW w:type="auto" w:w="0"/>
+    <w:p>
+      <w:pPr>
         <w:jc w:val="center"/>
-        <w:tblLook w:firstColumn="1" w:firstRow="1" w:lastColumn="0" w:lastRow="0" w:noHBand="0" w:noVBand="1" w:val="04A0"/>
-      </w:tblPr>
-      <w:tblGrid>
-        <w:gridCol w:w="4968"/>
-        <w:gridCol w:w="4968"/>
-      </w:tblGrid>
-      <w:tr>
-        <w:tc>
-          <w:tcPr>
-            <w:tcW w:type="dxa" w:w="4968"/>
-            <w:shd w:val="clear" w:color="auto" w:fill="E2E8F0"/>
-          </w:tcPr>
-          <w:p>
-            <w:r>
-              <w:rPr>
-                <w:b/>
-              </w:rPr>
-              <w:t>File Name</w:t>
-            </w:r>
-          </w:p>
-        </w:tc>
-        <w:tc>
-          <w:tcPr>
-            <w:tcW w:type="dxa" w:w="4968"/>
-            <w:shd w:val="clear" w:color="auto" w:fill="E2E8F0"/>
-          </w:tcPr>
-          <w:p>
-            <w:r>
-              <w:rPr>
-                <w:b/>
-              </w:rPr>
-              <w:t>Description</w:t>
-            </w:r>
-          </w:p>
-        </w:tc>
-      </w:tr>
-      <w:tr>
-        <w:tc>
-          <w:tcPr>
-            <w:tcW w:type="dxa" w:w="4968"/>
-            <w:shd w:val="clear" w:color="auto" w:fill="F8FAFC"/>
-          </w:tcPr>
-          <w:p>
-            <w:r>
-              <w:rPr>
-                <w:sz w:val="19"/>
-              </w:rPr>
-              <w:t>index.html</w:t>
-            </w:r>
-          </w:p>
-        </w:tc>
-        <w:tc>
-          <w:tcPr>
-            <w:tcW w:type="dxa" w:w="4968"/>
-            <w:shd w:val="clear" w:color="auto" w:fill="FFFFFF"/>
-          </w:tcPr>
-          <w:p>
-            <w:r>
-              <w:rPr>
-                <w:sz w:val="19"/>
-              </w:rPr>
-              <w:t>HTML5 form interface with Name, Email, Contact Number, and Submit button</w:t>
-            </w:r>
-          </w:p>
-        </w:tc>
-      </w:tr>
-      <w:tr>
-        <w:tc>
-          <w:tcPr>
-            <w:tcW w:type="dxa" w:w="4968"/>
-            <w:shd w:val="clear" w:color="auto" w:fill="F8FAFC"/>
-          </w:tcPr>
-          <w:p>
-            <w:r>
-              <w:rPr>
-                <w:sz w:val="19"/>
-              </w:rPr>
-              <w:t>test_form.py</w:t>
-            </w:r>
-          </w:p>
-        </w:tc>
-        <w:tc>
-          <w:tcPr>
-            <w:tcW w:type="dxa" w:w="4968"/>
-            <w:shd w:val="clear" w:color="auto" w:fill="FFFFFF"/>
-          </w:tcPr>
-          <w:p>
-            <w:r>
-              <w:rPr>
-                <w:sz w:val="19"/>
-              </w:rPr>
-              <w:t>Pytest automated verification script inspecting DOM with BeautifulSoup</w:t>
-            </w:r>
-          </w:p>
-        </w:tc>
-      </w:tr>
-      <w:tr>
-        <w:tc>
-          <w:tcPr>
-            <w:tcW w:type="dxa" w:w="4968"/>
-            <w:shd w:val="clear" w:color="auto" w:fill="F8FAFC"/>
-          </w:tcPr>
-          <w:p>
-            <w:r>
-              <w:rPr>
-                <w:sz w:val="19"/>
-              </w:rPr>
-              <w:t>Jenkinsfile</w:t>
-            </w:r>
-          </w:p>
-        </w:tc>
-        <w:tc>
-          <w:tcPr>
-            <w:tcW w:type="dxa" w:w="4968"/>
-            <w:shd w:val="clear" w:color="auto" w:fill="FFFFFF"/>
-          </w:tcPr>
-          <w:p>
-            <w:r>
-              <w:rPr>
-                <w:sz w:val="19"/>
-              </w:rPr>
-              <w:t>Declarative CI/CD pipeline retrieving code from Git and executing test suite</w:t>
-            </w:r>
-          </w:p>
-        </w:tc>
-      </w:tr>
-      <w:tr>
-        <w:tc>
-          <w:tcPr>
-            <w:tcW w:type="dxa" w:w="4968"/>
-            <w:shd w:val="clear" w:color="auto" w:fill="F8FAFC"/>
-          </w:tcPr>
-          <w:p>
-            <w:r>
-              <w:rPr>
-                <w:sz w:val="19"/>
-              </w:rPr>
-              <w:t>requirements.txt</w:t>
-            </w:r>
-          </w:p>
-        </w:tc>
-        <w:tc>
-          <w:tcPr>
-            <w:tcW w:type="dxa" w:w="4968"/>
-            <w:shd w:val="clear" w:color="auto" w:fill="FFFFFF"/>
-          </w:tcPr>
-          <w:p>
-            <w:r>
-              <w:rPr>
-                <w:sz w:val="19"/>
-              </w:rPr>
-              <w:t>Dependency specifications for automated testing and documentation generation</w:t>
-            </w:r>
-          </w:p>
-        </w:tc>
-      </w:tr>
-      <w:tr>
-        <w:tc>
-          <w:tcPr>
-            <w:tcW w:type="dxa" w:w="4968"/>
-            <w:shd w:val="clear" w:color="auto" w:fill="F8FAFC"/>
-          </w:tcPr>
-          <w:p>
-            <w:r>
-              <w:rPr>
-                <w:sz w:val="19"/>
-              </w:rPr>
-              <w:t>generate_documentation.py</w:t>
-            </w:r>
-          </w:p>
-        </w:tc>
-        <w:tc>
-          <w:tcPr>
-            <w:tcW w:type="dxa" w:w="4968"/>
-            <w:shd w:val="clear" w:color="auto" w:fill="FFFFFF"/>
-          </w:tcPr>
-          <w:p>
-            <w:r>
-              <w:rPr>
-                <w:sz w:val="19"/>
-              </w:rPr>
-              <w:t>Automated script that generates screenshots and this Word document</w:t>
-            </w:r>
-          </w:p>
-        </w:tc>
-      </w:tr>
-    </w:tbl>
+      </w:pPr>
+      <w:r>
+        <w:drawing>
+          <wp:inline xmlns:a="http://schemas.openxmlformats.org/drawingml/2006/main" xmlns:pic="http://schemas.openxmlformats.org/drawingml/2006/picture">
+            <wp:extent cx="5852160" cy="2903220"/>
+            <wp:docPr id="5" name="Picture 5"/>
+            <wp:cNvGraphicFramePr>
+              <a:graphicFrameLocks noChangeAspect="1"/>
+            </wp:cNvGraphicFramePr>
+            <a:graphic>
+              <a:graphicData uri="http://schemas.openxmlformats.org/drawingml/2006/picture">
+                <pic:pic>
+                  <pic:nvPicPr>
+                    <pic:cNvPr id="0" name="5_jenkins_pipeline_results.png"/>
+                    <pic:cNvPicPr/>
+                  </pic:nvPicPr>
+                  <pic:blipFill>
+                    <a:blip r:embed="rId13"/>
+                    <a:stretch>
+                      <a:fillRect/>
+                    </a:stretch>
+                  </pic:blipFill>
+                  <pic:spPr>
+                    <a:xfrm>
+                      <a:off x="0" y="0"/>
+                      <a:ext cx="5852160" cy="2903220"/>
+                    </a:xfrm>
+                    <a:prstGeom prst="rect"/>
+                  </pic:spPr>
+                </pic:pic>
+              </a:graphicData>
+            </a:graphic>
+          </wp:inline>
+        </w:drawing>
+      </w:r>
+    </w:p>
+    <w:p>
+      <w:pPr>
+        <w:jc w:val="center"/>
+      </w:pPr>
+      <w:r>
+        <w:rPr>
+          <w:i/>
+          <w:color w:val="64748B"/>
+          <w:sz w:val="19"/>
+        </w:rPr>
+        <w:t>Figure 5.1: Jenkins Job Overview showing Build #1 SUCCESS, Latest Test Result (no failures), and Test Result Trend</w:t>
+      </w:r>
+    </w:p>
+    <w:p/>
+    <w:p>
+      <w:pPr>
+        <w:pStyle w:val="Heading1"/>
+      </w:pPr>
+      <w:r>
+        <w:t>7. Complete Source Code Listings</w:t>
+      </w:r>
+    </w:p>
+    <w:p>
+      <w:pPr>
+        <w:pStyle w:val="Heading2"/>
+      </w:pPr>
+      <w:r>
+        <w:t>7.1 HTML Form (request completion/index.html)</w:t>
+      </w:r>
+    </w:p>
+    <w:p>
+      <w:r>
+        <w:t>&lt;!DOCTYPE html&gt;</w:t>
+        <w:br/>
+        <w:t>&lt;html lang="en"&gt;</w:t>
+        <w:br/>
+        <w:t>&lt;head&gt;</w:t>
+        <w:br/>
+        <w:t xml:space="preserve">    &lt;meta charset="UTF-8"&gt;</w:t>
+        <w:br/>
+        <w:t xml:space="preserve">    &lt;title&gt;Contact &amp; Registration Form&lt;/title&gt;</w:t>
+        <w:br/>
+        <w:t xml:space="preserve">    &lt;!-- Modern responsive styling omitted for brevity --&gt;</w:t>
+        <w:br/>
+        <w:t>&lt;/head&gt;</w:t>
+        <w:br/>
+        <w:t>&lt;body&gt;</w:t>
+        <w:br/>
+        <w:t xml:space="preserve">    &lt;form id="contactForm" method="POST"&gt;</w:t>
+        <w:br/>
+        <w:t xml:space="preserve">        &lt;input type="text" id="name" name="name" placeholder="John Doe" required&gt;</w:t>
+        <w:br/>
+        <w:t xml:space="preserve">        &lt;input type="email" id="email" name="email" placeholder="john.doe@example.com" required&gt;</w:t>
+        <w:br/>
+        <w:t xml:space="preserve">        &lt;input type="tel" id="contactNumber" name="contactNumber" pattern="[0-9]{10}" required&gt;</w:t>
+        <w:br/>
+        <w:t xml:space="preserve">        &lt;button type="submit" id="submitBtn"&gt;Submit&lt;/button&gt;</w:t>
+        <w:br/>
+        <w:t xml:space="preserve">    &lt;/form&gt;</w:t>
+        <w:br/>
+        <w:t>&lt;/body&gt;</w:t>
+        <w:br/>
+        <w:t>&lt;/html&gt;</w:t>
+      </w:r>
+    </w:p>
+    <w:p>
+      <w:pPr>
+        <w:pStyle w:val="Heading2"/>
+      </w:pPr>
+      <w:r>
+        <w:t>7.2 Jenkins Pipeline (request completion/Jenkinsfile)</w:t>
+      </w:r>
+    </w:p>
+    <w:p>
+      <w:r>
+        <w:t>pipeline {</w:t>
+        <w:br/>
+        <w:t xml:space="preserve">    agent any</w:t>
+        <w:br/>
+        <w:t xml:space="preserve">    stages {</w:t>
+        <w:br/>
+        <w:t xml:space="preserve">        stage('Checkout Source Code') { steps { checkout scm } }</w:t>
+        <w:br/>
+        <w:t xml:space="preserve">        stage('Set Up Environment') { steps { bat 'python -m pip install pytest beautifulsoup4' } }</w:t>
+        <w:br/>
+        <w:t xml:space="preserve">        stage('Automated HTML Form Testing') {</w:t>
+        <w:br/>
+        <w:t xml:space="preserve">            steps { bat 'python -m pytest "request completion/test_form.py" -v --junitxml="request completion/test-results.xml"' }</w:t>
+        <w:br/>
+        <w:t xml:space="preserve">        }</w:t>
+        <w:br/>
+        <w:t xml:space="preserve">    }</w:t>
+        <w:br/>
+        <w:t xml:space="preserve">    post {</w:t>
+        <w:br/>
+        <w:t xml:space="preserve">        always { junit 'request completion/test-results.xml' }</w:t>
+        <w:br/>
+        <w:t xml:space="preserve">        success { echo 'SUCCESS: All HTML Form automated tests passed successfully!' }</w:t>
+        <w:br/>
+        <w:t xml:space="preserve">    }</w:t>
+        <w:br/>
+        <w:t>}</w:t>
+      </w:r>
+    </w:p>
     <w:sectPr>
       <w:pgSz w:w="12240" w:h="15840"/>
-      <w:pgMar w:top="1152" w:right="1152" w:bottom="1152" w:left="1152" w:header="720" w:footer="720" w:gutter="0"/>
+      <w:pgMar w:top="1080" w:right="1080" w:bottom="1080" w:left="1080" w:header="720" w:footer="720" w:gutter="0"/>
       <w:cols w:space="720"/>
       <w:docGrid w:linePitch="360"/>
     </w:sectPr>

</xml_diff>